<commit_message>
Change labels for offspring counts
</commit_message>
<xml_diff>
--- a/tables/Table_1.docx
+++ b/tables/Table_1.docx
@@ -536,7 +536,7 @@
                 <w:szCs w:val="24"/>
                 <w:color w:val="000000"/>
               </w:rPr>
-              <w:t xml:space="preserve">(0.07–0.32)</w:t>
+              <w:t xml:space="preserve">(0.07–0.33)</w:t>
             </w:r>
           </w:p>
         </w:tc>
@@ -617,7 +617,7 @@
                 <w:szCs w:val="24"/>
                 <w:color w:val="000000"/>
               </w:rPr>
-              <w:t xml:space="preserve">(0.26–0.58)</w:t>
+              <w:t xml:space="preserve">(0.26–0.57)</w:t>
             </w:r>
           </w:p>
         </w:tc>
@@ -839,7 +839,7 @@
                 <w:szCs w:val="24"/>
                 <w:color w:val="000000"/>
               </w:rPr>
-              <w:t xml:space="preserve">Offspring lifetime</w:t>
+              <w:t xml:space="preserve">Offspring total</w:t>
             </w:r>
           </w:p>
         </w:tc>
@@ -894,7 +894,7 @@
                 <w:szCs w:val="24"/>
                 <w:color w:val="000000"/>
               </w:rPr>
-              <w:t xml:space="preserve">0.76 </w:t>
+              <w:t xml:space="preserve">0.75 </w:t>
             </w:r>
             <w:r>
               <w:rPr>
@@ -920,7 +920,7 @@
                 <w:szCs w:val="24"/>
                 <w:color w:val="000000"/>
               </w:rPr>
-              <w:t xml:space="preserve">(0.58–0.95)</w:t>
+              <w:t xml:space="preserve">(0.58–0.96)</w:t>
             </w:r>
           </w:p>
         </w:tc>
@@ -975,7 +975,7 @@
                 <w:szCs w:val="24"/>
                 <w:color w:val="000000"/>
               </w:rPr>
-              <w:t xml:space="preserve">0.78 </w:t>
+              <w:t xml:space="preserve">0.77 </w:t>
             </w:r>
             <w:r>
               <w:rPr>
@@ -1001,7 +1001,7 @@
                 <w:szCs w:val="24"/>
                 <w:color w:val="000000"/>
               </w:rPr>
-              <w:t xml:space="preserve">(0.61–0.99)</w:t>
+              <w:t xml:space="preserve">(0.6–0.98)</w:t>
             </w:r>
           </w:p>
         </w:tc>
@@ -1304,7 +1304,7 @@
                 <w:szCs w:val="24"/>
                 <w:color w:val="000000"/>
               </w:rPr>
-              <w:t xml:space="preserve">(3.14–3.96)</w:t>
+              <w:t xml:space="preserve">(3.14–3.99)</w:t>
             </w:r>
           </w:p>
         </w:tc>
@@ -1359,7 +1359,7 @@
                 <w:szCs w:val="24"/>
                 <w:color w:val="000000"/>
               </w:rPr>
-              <w:t xml:space="preserve">1.91 </w:t>
+              <w:t xml:space="preserve">1.9 </w:t>
             </w:r>
             <w:r>
               <w:rPr>
@@ -1385,7 +1385,7 @@
                 <w:szCs w:val="24"/>
                 <w:color w:val="000000"/>
               </w:rPr>
-              <w:t xml:space="preserve">(1.69–2.14)</w:t>
+              <w:t xml:space="preserve">(1.68–2.15)</w:t>
             </w:r>
           </w:p>
         </w:tc>
@@ -1547,7 +1547,7 @@
                 <w:szCs w:val="24"/>
                 <w:color w:val="000000"/>
               </w:rPr>
-              <w:t xml:space="preserve">(0.62–0.71)</w:t>
+              <w:t xml:space="preserve">(0.62–0.7)</w:t>
             </w:r>
           </w:p>
         </w:tc>
@@ -1662,7 +1662,7 @@
                 <w:szCs w:val="24"/>
                 <w:color w:val="000000"/>
               </w:rPr>
-              <w:t xml:space="preserve">4.63 </w:t>
+              <w:t xml:space="preserve">4.64 </w:t>
             </w:r>
             <w:r>
               <w:rPr>
@@ -1688,7 +1688,7 @@
                 <w:szCs w:val="24"/>
                 <w:color w:val="000000"/>
               </w:rPr>
-              <w:t xml:space="preserve">(4.17–5.16)</w:t>
+              <w:t xml:space="preserve">(4.16–5.19)</w:t>
             </w:r>
           </w:p>
         </w:tc>
@@ -1769,7 +1769,7 @@
                 <w:szCs w:val="24"/>
                 <w:color w:val="000000"/>
               </w:rPr>
-              <w:t xml:space="preserve">(2.33–2.95)</w:t>
+              <w:t xml:space="preserve">(2.33–2.94)</w:t>
             </w:r>
           </w:p>
         </w:tc>
@@ -1850,7 +1850,7 @@
                 <w:szCs w:val="24"/>
                 <w:color w:val="000000"/>
               </w:rPr>
-              <w:t xml:space="preserve">(0.78–0.87)</w:t>
+              <w:t xml:space="preserve">(0.79–0.87)</w:t>
             </w:r>
           </w:p>
         </w:tc>
@@ -1931,7 +1931,7 @@
                 <w:szCs w:val="24"/>
                 <w:color w:val="000000"/>
               </w:rPr>
-              <w:t xml:space="preserve">(0.69–0.8)</w:t>
+              <w:t xml:space="preserve">(0.69–0.79)</w:t>
             </w:r>
           </w:p>
         </w:tc>

</xml_diff>